<commit_message>
Update Before Migrating to Postgresql
</commit_message>
<xml_diff>
--- a/quarry-permit-test/public/mgbform8-1A.docx
+++ b/quarry-permit-test/public/mgbform8-1A.docx
@@ -1114,924 +1114,1087 @@
         </w:rPr>
         <w:t>______</w:t>
       </w:r>
+    </w:p>
+    <w:p>
+      <w:pPr>
+        <w:ind w:left="1440" w:hanging="720"/>
+        <w:jc w:val="both"/>
+        <w:rPr>
+          <w:rFonts w:ascii="Times New Roman" w:hAnsi="Times New Roman"/>
+          <w:sz w:val="24"/>
+        </w:rPr>
+      </w:pPr>
+      <w:r>
+        <w:rPr>
+          <w:rFonts w:ascii="Times New Roman" w:hAnsi="Times New Roman"/>
+          <w:sz w:val="24"/>
+        </w:rPr>
+        <w:tab/>
+      </w:r>
+      <w:r>
+        <w:rPr>
+          <w:rFonts w:ascii="Times New Roman" w:hAnsi="Times New Roman"/>
+          <w:sz w:val="24"/>
+        </w:rPr>
+        <w:t xml:space="preserve">(indicate civil status and if married, give name and citizenship of spouse) </w:t>
+      </w:r>
+    </w:p>
+    <w:p>
+      <w:pPr>
+        <w:jc w:val="both"/>
+        <w:rPr>
+          <w:rFonts w:ascii="Times New Roman" w:hAnsi="Times New Roman"/>
+          <w:sz w:val="24"/>
+        </w:rPr>
+      </w:pPr>
+    </w:p>
+    <w:p>
+      <w:pPr>
+        <w:ind w:left="1440" w:hanging="720"/>
+        <w:jc w:val="both"/>
+        <w:rPr>
+          <w:rFonts w:ascii="Times New Roman" w:hAnsi="Times New Roman"/>
+          <w:sz w:val="24"/>
+        </w:rPr>
+      </w:pPr>
+      <w:r>
+        <w:rPr>
+          <w:rFonts w:ascii="Times New Roman" w:hAnsi="Times New Roman"/>
+          <w:sz w:val="24"/>
+        </w:rPr>
+        <w:t>O</w:t>
+      </w:r>
+      <w:r>
+        <w:rPr>
+          <w:rFonts w:ascii="Times New Roman" w:hAnsi="Times New Roman"/>
+          <w:sz w:val="24"/>
+        </w:rPr>
+        <w:tab/>
+      </w:r>
+      <w:r>
+        <w:rPr>
+          <w:rFonts w:ascii="Times New Roman" w:hAnsi="Times New Roman"/>
+          <w:sz w:val="24"/>
+        </w:rPr>
+        <w:t>In the case of partnership or corporation, must be duly registered and incorporated under the laws of, and authorized to transact business  in the Philippines,   at least sixty per  centum (60%) of the capital stock of this partnership, corporation shall be owned and held by citizens of the Philippines.  A certified copy of the SEC Registration, Articles of Partnership  or Incorporation shall be submitted herewith.</w:t>
+      </w:r>
+    </w:p>
+    <w:p>
+      <w:pPr>
+        <w:jc w:val="both"/>
+        <w:rPr>
+          <w:rFonts w:ascii="Times New Roman" w:hAnsi="Times New Roman"/>
+          <w:sz w:val="24"/>
+        </w:rPr>
+      </w:pPr>
+    </w:p>
+    <w:p>
+      <w:pPr>
+        <w:jc w:val="both"/>
+        <w:rPr>
+          <w:rFonts w:ascii="Times New Roman" w:hAnsi="Times New Roman"/>
+          <w:sz w:val="24"/>
+        </w:rPr>
+      </w:pPr>
+      <w:r>
+        <w:rPr>
+          <w:rFonts w:ascii="Times New Roman" w:hAnsi="Times New Roman"/>
+          <w:sz w:val="24"/>
+        </w:rPr>
+        <w:t>Attached also are the following supporting papers:</w:t>
+      </w:r>
+    </w:p>
+    <w:p>
+      <w:pPr>
+        <w:jc w:val="both"/>
+        <w:rPr>
+          <w:rFonts w:ascii="Times New Roman" w:hAnsi="Times New Roman"/>
+          <w:sz w:val="24"/>
+        </w:rPr>
+      </w:pPr>
+    </w:p>
+    <w:p>
+      <w:pPr>
+        <w:ind w:left="720" w:hanging="720"/>
+        <w:jc w:val="both"/>
+        <w:rPr>
+          <w:rFonts w:ascii="Times New Roman" w:hAnsi="Times New Roman"/>
+          <w:sz w:val="24"/>
+        </w:rPr>
+      </w:pPr>
+      <w:r>
+        <w:rPr>
+          <w:rFonts w:ascii="Times New Roman" w:hAnsi="Times New Roman"/>
+          <w:sz w:val="24"/>
+        </w:rPr>
+        <w:t>O</w:t>
+      </w:r>
+      <w:r>
+        <w:rPr>
+          <w:rFonts w:ascii="Times New Roman" w:hAnsi="Times New Roman"/>
+          <w:sz w:val="24"/>
+        </w:rPr>
+        <w:tab/>
+      </w:r>
+      <w:r>
+        <w:rPr>
+          <w:rFonts w:ascii="Times New Roman" w:hAnsi="Times New Roman"/>
+          <w:sz w:val="24"/>
+        </w:rPr>
+        <w:t>Clearance,  when required, from the Bureau of Public Works, Bureau of Public Highways, National Power Corporation, National Irrigation Administration and/or other government  agencies, that the proposed excavations in the area  applied for will not adversely affect or cause damage to existing  public and private properties, multipurpose dams, reservoirs, seawalls, dikes, bridges, buildings, highways and other infrastructures;</w:t>
+      </w:r>
+    </w:p>
+    <w:p>
+      <w:pPr>
+        <w:ind w:left="1440" w:hanging="1440"/>
+        <w:jc w:val="both"/>
+        <w:rPr>
+          <w:rFonts w:ascii="Times New Roman" w:hAnsi="Times New Roman"/>
+          <w:sz w:val="24"/>
+        </w:rPr>
+      </w:pPr>
+    </w:p>
+    <w:p>
+      <w:pPr>
+        <w:ind w:left="720" w:hanging="720"/>
+        <w:jc w:val="both"/>
+        <w:rPr>
+          <w:rFonts w:ascii="Times New Roman" w:hAnsi="Times New Roman"/>
+          <w:sz w:val="24"/>
+        </w:rPr>
+      </w:pPr>
+      <w:r>
+        <w:rPr>
+          <w:rFonts w:ascii="Times New Roman" w:hAnsi="Times New Roman"/>
+          <w:sz w:val="24"/>
+        </w:rPr>
+        <w:t>O</w:t>
+      </w:r>
+      <w:r>
+        <w:rPr>
+          <w:rFonts w:ascii="Times New Roman" w:hAnsi="Times New Roman"/>
+          <w:sz w:val="24"/>
+        </w:rPr>
+        <w:tab/>
+      </w:r>
+      <w:r>
+        <w:rPr>
+          <w:rFonts w:ascii="Times New Roman" w:hAnsi="Times New Roman"/>
+          <w:sz w:val="24"/>
+        </w:rPr>
+        <w:t>Written consent of owners of the private lands adjoining the area that may be affected by excavations to be undertaken;</w:t>
+      </w:r>
+    </w:p>
+    <w:p>
+      <w:pPr>
+        <w:ind w:left="720" w:hanging="720"/>
+        <w:jc w:val="both"/>
+        <w:rPr>
+          <w:rFonts w:ascii="Times New Roman" w:hAnsi="Times New Roman"/>
+          <w:sz w:val="24"/>
+        </w:rPr>
+      </w:pPr>
+    </w:p>
+    <w:p>
+      <w:pPr>
+        <w:ind w:left="720" w:hanging="720"/>
+        <w:jc w:val="both"/>
+        <w:rPr>
+          <w:rFonts w:ascii="Times New Roman" w:hAnsi="Times New Roman"/>
+          <w:sz w:val="24"/>
+        </w:rPr>
+      </w:pPr>
+      <w:r>
+        <w:rPr>
+          <w:rFonts w:ascii="Times New Roman" w:hAnsi="Times New Roman"/>
+          <w:sz w:val="24"/>
+        </w:rPr>
+        <w:t>O</w:t>
+      </w:r>
+      <w:r>
+        <w:rPr>
+          <w:rFonts w:ascii="Times New Roman" w:hAnsi="Times New Roman"/>
+          <w:sz w:val="24"/>
+        </w:rPr>
+        <w:tab/>
+      </w:r>
+      <w:r>
+        <w:rPr>
+          <w:rFonts w:ascii="Times New Roman" w:hAnsi="Times New Roman"/>
+          <w:sz w:val="24"/>
+        </w:rPr>
+        <w:t>Commitment to secure Environmental Compliance Certificate (ECC) prior to extraction.</w:t>
+      </w:r>
+    </w:p>
+    <w:p>
+      <w:pPr>
+        <w:ind w:left="1440" w:hanging="1440"/>
+        <w:jc w:val="both"/>
+        <w:rPr>
+          <w:rFonts w:ascii="Times New Roman" w:hAnsi="Times New Roman"/>
+          <w:sz w:val="24"/>
+        </w:rPr>
+      </w:pPr>
+    </w:p>
+    <w:p>
+      <w:pPr>
+        <w:jc w:val="both"/>
+        <w:rPr>
+          <w:rFonts w:ascii="Times New Roman" w:hAnsi="Times New Roman"/>
+          <w:sz w:val="24"/>
+        </w:rPr>
+      </w:pPr>
+      <w:r>
+        <w:rPr>
+          <w:rFonts w:ascii="Times New Roman" w:hAnsi="Times New Roman"/>
+          <w:sz w:val="24"/>
+        </w:rPr>
+        <w:tab/>
+      </w:r>
+      <w:r>
+        <w:rPr>
+          <w:rFonts w:ascii="Times New Roman" w:hAnsi="Times New Roman"/>
+          <w:sz w:val="24"/>
+        </w:rPr>
+        <w:t xml:space="preserve">The applicant binds himself/herself or itself to pay the amount of </w:t>
+      </w:r>
+      <w:r>
+        <w:rPr>
+          <w:rFonts w:hint="default" w:ascii="Times New Roman" w:hAnsi="Times New Roman"/>
+          <w:sz w:val="24"/>
+          <w:u w:val="single"/>
+          <w:lang w:val="en-US"/>
+        </w:rPr>
+        <w:t>${</w:t>
+      </w:r>
+      <w:r>
+        <w:rPr>
+          <w:rFonts w:hint="default"/>
+          <w:sz w:val="24"/>
+          <w:u w:val="single"/>
+          <w:lang w:val="en-US"/>
+        </w:rPr>
+        <w:t>AmountInWord</w:t>
+      </w:r>
+      <w:r>
+        <w:rPr>
+          <w:rFonts w:hint="default" w:ascii="Times New Roman" w:hAnsi="Times New Roman"/>
+          <w:sz w:val="24"/>
+          <w:u w:val="single"/>
+          <w:lang w:val="en-US"/>
+        </w:rPr>
+        <w:t>}</w:t>
+      </w:r>
+      <w:r>
+        <w:rPr>
+          <w:rFonts w:ascii="Times New Roman" w:hAnsi="Times New Roman"/>
+          <w:sz w:val="24"/>
+        </w:rPr>
+        <w:t xml:space="preserve"> (</w:t>
+      </w:r>
+      <w:r>
+        <w:rPr>
+          <w:rFonts w:ascii="Times New Roman" w:hAnsi="Times New Roman"/>
+          <w:strike/>
+          <w:sz w:val="24"/>
+        </w:rPr>
+        <w:t>P</w:t>
+      </w:r>
+      <w:r>
+        <w:rPr>
+          <w:rFonts w:hint="default" w:ascii="Times New Roman" w:hAnsi="Times New Roman"/>
+          <w:sz w:val="24"/>
+          <w:u w:val="single"/>
+          <w:lang w:val="en-US"/>
+        </w:rPr>
+        <w:t>${</w:t>
+      </w:r>
+      <w:r>
+        <w:rPr>
+          <w:rFonts w:hint="default"/>
+          <w:sz w:val="24"/>
+          <w:u w:val="single"/>
+          <w:lang w:val="en-US"/>
+        </w:rPr>
+        <w:t>AmountInNumber</w:t>
+      </w:r>
+      <w:r>
+        <w:rPr>
+          <w:rFonts w:hint="default" w:ascii="Times New Roman" w:hAnsi="Times New Roman"/>
+          <w:sz w:val="24"/>
+          <w:u w:val="single"/>
+          <w:lang w:val="en-US"/>
+        </w:rPr>
+        <w:t>}</w:t>
+      </w:r>
+      <w:r>
+        <w:rPr>
+          <w:rFonts w:ascii="Times New Roman" w:hAnsi="Times New Roman"/>
+          <w:sz w:val="24"/>
+        </w:rPr>
+        <w:t xml:space="preserve">) covering the total fee for the materials applied for, and to file a </w:t>
+      </w:r>
+      <w:r>
+        <w:rPr>
+          <w:rFonts w:hint="default" w:ascii="Times New Roman" w:hAnsi="Times New Roman"/>
+          <w:sz w:val="24"/>
+          <w:u w:val="single"/>
+          <w:lang w:val="en-US"/>
+        </w:rPr>
+        <w:t>${</w:t>
+      </w:r>
+      <w:r>
+        <w:rPr>
+          <w:rFonts w:hint="default"/>
+          <w:sz w:val="24"/>
+          <w:u w:val="single"/>
+          <w:lang w:val="en-US"/>
+        </w:rPr>
+        <w:t>BondName</w:t>
+      </w:r>
+      <w:r>
+        <w:rPr>
+          <w:rFonts w:hint="default" w:ascii="Times New Roman" w:hAnsi="Times New Roman"/>
+          <w:sz w:val="24"/>
+          <w:u w:val="single"/>
+          <w:lang w:val="en-US"/>
+        </w:rPr>
+        <w:t>}</w:t>
+      </w:r>
+      <w:r>
+        <w:rPr>
+          <w:rFonts w:ascii="Times New Roman" w:hAnsi="Times New Roman"/>
+          <w:sz w:val="24"/>
+        </w:rPr>
+        <w:t xml:space="preserve"> bond in the amount of </w:t>
+      </w:r>
+      <w:r>
+        <w:rPr>
+          <w:rFonts w:hint="default" w:ascii="Times New Roman" w:hAnsi="Times New Roman"/>
+          <w:sz w:val="24"/>
+          <w:u w:val="single"/>
+          <w:lang w:val="en-US"/>
+        </w:rPr>
+        <w:t>${</w:t>
+      </w:r>
+      <w:r>
+        <w:rPr>
+          <w:rFonts w:hint="default"/>
+          <w:sz w:val="24"/>
+          <w:u w:val="single"/>
+          <w:lang w:val="en-US"/>
+        </w:rPr>
+        <w:t>BondAmountWord</w:t>
+      </w:r>
+      <w:r>
+        <w:rPr>
+          <w:rFonts w:hint="default" w:ascii="Times New Roman" w:hAnsi="Times New Roman"/>
+          <w:sz w:val="24"/>
+          <w:u w:val="single"/>
+          <w:lang w:val="en-US"/>
+        </w:rPr>
+        <w:t>}</w:t>
+      </w:r>
+      <w:r>
+        <w:rPr>
+          <w:rFonts w:ascii="Times New Roman" w:hAnsi="Times New Roman"/>
+          <w:sz w:val="24"/>
+        </w:rPr>
+        <w:t xml:space="preserve">, (surety, cash or personal) ( </w:t>
+      </w:r>
+      <w:r>
+        <w:rPr>
+          <w:rFonts w:ascii="Times New Roman" w:hAnsi="Times New Roman"/>
+          <w:strike/>
+          <w:sz w:val="24"/>
+        </w:rPr>
+        <w:t>P</w:t>
+      </w:r>
+      <w:r>
+        <w:rPr>
+          <w:rFonts w:hint="default" w:ascii="Times New Roman" w:hAnsi="Times New Roman"/>
+          <w:sz w:val="24"/>
+          <w:u w:val="single"/>
+          <w:lang w:val="en-US"/>
+        </w:rPr>
+        <w:t>${</w:t>
+      </w:r>
+      <w:r>
+        <w:rPr>
+          <w:rFonts w:hint="default"/>
+          <w:sz w:val="24"/>
+          <w:u w:val="single"/>
+          <w:lang w:val="en-US"/>
+        </w:rPr>
+        <w:t>BondAmountNumber</w:t>
+      </w:r>
+      <w:r>
+        <w:rPr>
+          <w:rFonts w:hint="default" w:ascii="Times New Roman" w:hAnsi="Times New Roman"/>
+          <w:sz w:val="24"/>
+          <w:u w:val="single"/>
+          <w:lang w:val="en-US"/>
+        </w:rPr>
+        <w:t>}</w:t>
+      </w:r>
+      <w:r>
+        <w:rPr>
+          <w:rFonts w:ascii="Times New Roman" w:hAnsi="Times New Roman"/>
+          <w:sz w:val="24"/>
+        </w:rPr>
+        <w:t>); and to strictly and fully comply with all existing laws, rules and regulations, orders, instructions, resolutions and ordinances governing the filing and approval of application and the granting of the permits for the extraction and/or disposition of the materials herein applied for.  Failure to do so shall cause the cancellation of the permit and the confiscation and forfeiture of the bond and all the payments, if any, made by the permittee, in favor of the Government.  This application is made for the exclusive use and benefit of the applicant and not either directly or indirectly, for the benefit of any other person, corporation, partnership, and for the sole purpose of removing and disposing of the said materials in the manner stated above.  All the statements in this application shall be considered as integral part of the permit to be issued to him.</w:t>
+      </w:r>
+    </w:p>
+    <w:p>
+      <w:pPr>
+        <w:jc w:val="both"/>
+        <w:rPr>
+          <w:rFonts w:ascii="Times New Roman" w:hAnsi="Times New Roman"/>
+          <w:sz w:val="24"/>
+        </w:rPr>
+      </w:pPr>
+    </w:p>
+    <w:p>
+      <w:pPr>
+        <w:jc w:val="both"/>
+        <w:rPr>
+          <w:rFonts w:ascii="Times New Roman" w:hAnsi="Times New Roman"/>
+          <w:sz w:val="24"/>
+        </w:rPr>
+      </w:pPr>
+      <w:r>
+        <w:rPr>
+          <w:rFonts w:ascii="Times New Roman" w:hAnsi="Times New Roman"/>
+          <w:sz w:val="24"/>
+        </w:rPr>
+        <w:tab/>
+      </w:r>
+      <w:r>
+        <w:rPr>
+          <w:rFonts w:ascii="Times New Roman" w:hAnsi="Times New Roman"/>
+          <w:sz w:val="24"/>
+        </w:rPr>
+        <w:t>The above statements are true and correct to my best knowledge and belief.</w:t>
+      </w:r>
+    </w:p>
+    <w:p>
+      <w:pPr>
+        <w:jc w:val="both"/>
+        <w:rPr>
+          <w:rFonts w:ascii="Times New Roman" w:hAnsi="Times New Roman"/>
+          <w:sz w:val="24"/>
+        </w:rPr>
+      </w:pPr>
+    </w:p>
+    <w:p>
+      <w:pPr>
+        <w:jc w:val="both"/>
+        <w:rPr>
+          <w:rFonts w:ascii="Times New Roman" w:hAnsi="Times New Roman"/>
+          <w:sz w:val="24"/>
+        </w:rPr>
+      </w:pPr>
+      <w:r>
+        <w:rPr>
+          <w:rFonts w:ascii="Times New Roman" w:hAnsi="Times New Roman"/>
+          <w:sz w:val="24"/>
+        </w:rPr>
+        <w:tab/>
+      </w:r>
+      <w:r>
+        <w:rPr>
+          <w:rFonts w:ascii="Times New Roman" w:hAnsi="Times New Roman"/>
+          <w:sz w:val="24"/>
+        </w:rPr>
+        <w:tab/>
+      </w:r>
+      <w:r>
+        <w:rPr>
+          <w:rFonts w:ascii="Times New Roman" w:hAnsi="Times New Roman"/>
+          <w:sz w:val="24"/>
+        </w:rPr>
+        <w:tab/>
+      </w:r>
+      <w:r>
+        <w:rPr>
+          <w:rFonts w:ascii="Times New Roman" w:hAnsi="Times New Roman"/>
+          <w:sz w:val="24"/>
+        </w:rPr>
+        <w:tab/>
+      </w:r>
+      <w:r>
+        <w:rPr>
+          <w:rFonts w:ascii="Times New Roman" w:hAnsi="Times New Roman"/>
+          <w:sz w:val="24"/>
+        </w:rPr>
+        <w:tab/>
+      </w:r>
+      <w:r>
+        <w:rPr>
+          <w:rFonts w:ascii="Times New Roman" w:hAnsi="Times New Roman"/>
+          <w:sz w:val="24"/>
+        </w:rPr>
+        <w:tab/>
+      </w:r>
+      <w:r>
+        <w:rPr>
+          <w:rFonts w:ascii="Times New Roman" w:hAnsi="Times New Roman"/>
+          <w:sz w:val="24"/>
+        </w:rPr>
+        <w:tab/>
+      </w:r>
+      <w:r>
+        <w:rPr>
+          <w:rFonts w:ascii="Times New Roman" w:hAnsi="Times New Roman"/>
+          <w:sz w:val="24"/>
+        </w:rPr>
+        <w:t>Very respectfully,</w:t>
+      </w:r>
+    </w:p>
+    <w:p>
+      <w:pPr>
+        <w:jc w:val="both"/>
+        <w:rPr>
+          <w:rFonts w:ascii="Times New Roman" w:hAnsi="Times New Roman"/>
+          <w:sz w:val="24"/>
+        </w:rPr>
+      </w:pPr>
+    </w:p>
+    <w:p>
+      <w:pPr>
+        <w:jc w:val="both"/>
+        <w:rPr>
+          <w:rFonts w:hint="default" w:ascii="Times New Roman" w:hAnsi="Times New Roman"/>
+          <w:sz w:val="24"/>
+          <w:lang w:val="en-US"/>
+        </w:rPr>
+      </w:pPr>
+      <w:r>
+        <w:rPr>
+          <w:rFonts w:ascii="Times New Roman" w:hAnsi="Times New Roman"/>
+          <w:sz w:val="24"/>
+        </w:rPr>
+        <w:tab/>
+      </w:r>
+      <w:r>
+        <w:rPr>
+          <w:rFonts w:ascii="Times New Roman" w:hAnsi="Times New Roman"/>
+          <w:sz w:val="24"/>
+        </w:rPr>
+        <w:tab/>
+      </w:r>
+      <w:r>
+        <w:rPr>
+          <w:rFonts w:ascii="Times New Roman" w:hAnsi="Times New Roman"/>
+          <w:sz w:val="24"/>
+        </w:rPr>
+        <w:tab/>
+      </w:r>
+      <w:r>
+        <w:rPr>
+          <w:rFonts w:ascii="Times New Roman" w:hAnsi="Times New Roman"/>
+          <w:sz w:val="24"/>
+        </w:rPr>
+        <w:tab/>
+      </w:r>
+      <w:r>
+        <w:rPr>
+          <w:rFonts w:ascii="Times New Roman" w:hAnsi="Times New Roman"/>
+          <w:sz w:val="24"/>
+        </w:rPr>
+        <w:tab/>
+      </w:r>
+      <w:r>
+        <w:rPr>
+          <w:rFonts w:ascii="Times New Roman" w:hAnsi="Times New Roman"/>
+          <w:sz w:val="24"/>
+        </w:rPr>
+        <w:tab/>
+      </w:r>
+      <w:r>
+        <w:rPr>
+          <w:rFonts w:ascii="Times New Roman" w:hAnsi="Times New Roman"/>
+          <w:sz w:val="24"/>
+        </w:rPr>
+        <w:tab/>
+      </w:r>
+      <w:r>
+        <w:rPr>
+          <w:rFonts w:hint="default"/>
+          <w:sz w:val="24"/>
+          <w:lang w:val="en-US"/>
+        </w:rPr>
+        <w:t xml:space="preserve"> ____</w:t>
+      </w:r>
+      <w:r>
+        <w:rPr>
+          <w:rFonts w:hint="default" w:ascii="Times New Roman" w:hAnsi="Times New Roman"/>
+          <w:sz w:val="24"/>
+          <w:u w:val="single"/>
+          <w:lang w:val="en-US"/>
+        </w:rPr>
+        <w:t>${</w:t>
+      </w:r>
+      <w:r>
+        <w:rPr>
+          <w:rFonts w:hint="default"/>
+          <w:sz w:val="24"/>
+          <w:u w:val="single"/>
+          <w:lang w:val="en-US"/>
+        </w:rPr>
+        <w:t>ApplicantName</w:t>
+      </w:r>
+      <w:r>
+        <w:rPr>
+          <w:rFonts w:hint="default" w:ascii="Times New Roman" w:hAnsi="Times New Roman"/>
+          <w:sz w:val="24"/>
+          <w:u w:val="single"/>
+          <w:lang w:val="en-US"/>
+        </w:rPr>
+        <w:t>}</w:t>
+      </w:r>
+      <w:r>
+        <w:rPr>
+          <w:rFonts w:hint="default"/>
+          <w:sz w:val="24"/>
+          <w:u w:val="single"/>
+          <w:lang w:val="en-US"/>
+        </w:rPr>
+        <w:t>____</w:t>
+      </w:r>
+    </w:p>
+    <w:p>
+      <w:pPr>
+        <w:jc w:val="both"/>
+        <w:rPr>
+          <w:rFonts w:ascii="Times New Roman" w:hAnsi="Times New Roman"/>
+          <w:sz w:val="24"/>
+        </w:rPr>
+      </w:pPr>
+      <w:r>
+        <w:rPr>
+          <w:rFonts w:ascii="Times New Roman" w:hAnsi="Times New Roman"/>
+          <w:sz w:val="24"/>
+        </w:rPr>
+        <w:tab/>
+      </w:r>
+      <w:r>
+        <w:rPr>
+          <w:rFonts w:ascii="Times New Roman" w:hAnsi="Times New Roman"/>
+          <w:sz w:val="24"/>
+        </w:rPr>
+        <w:tab/>
+      </w:r>
+      <w:r>
+        <w:rPr>
+          <w:rFonts w:ascii="Times New Roman" w:hAnsi="Times New Roman"/>
+          <w:sz w:val="24"/>
+        </w:rPr>
+        <w:tab/>
+      </w:r>
+      <w:r>
+        <w:rPr>
+          <w:rFonts w:ascii="Times New Roman" w:hAnsi="Times New Roman"/>
+          <w:sz w:val="24"/>
+        </w:rPr>
+        <w:tab/>
+      </w:r>
+      <w:r>
+        <w:rPr>
+          <w:rFonts w:ascii="Times New Roman" w:hAnsi="Times New Roman"/>
+          <w:sz w:val="24"/>
+        </w:rPr>
+        <w:tab/>
+      </w:r>
+      <w:r>
+        <w:rPr>
+          <w:rFonts w:ascii="Times New Roman" w:hAnsi="Times New Roman"/>
+          <w:sz w:val="24"/>
+        </w:rPr>
+        <w:tab/>
+      </w:r>
+      <w:r>
+        <w:rPr>
+          <w:rFonts w:ascii="Times New Roman" w:hAnsi="Times New Roman"/>
+          <w:sz w:val="24"/>
+        </w:rPr>
+        <w:tab/>
+      </w:r>
+      <w:r>
+        <w:rPr>
+          <w:rFonts w:ascii="Times New Roman" w:hAnsi="Times New Roman"/>
+          <w:sz w:val="24"/>
+        </w:rPr>
+        <w:tab/>
+      </w:r>
+      <w:r>
+        <w:rPr>
+          <w:rFonts w:ascii="Times New Roman" w:hAnsi="Times New Roman"/>
+          <w:sz w:val="24"/>
+        </w:rPr>
+        <w:t>(Applicant)</w:t>
+      </w:r>
+    </w:p>
+    <w:p>
+      <w:pPr>
+        <w:jc w:val="both"/>
+        <w:rPr>
+          <w:rFonts w:ascii="Times New Roman" w:hAnsi="Times New Roman"/>
+          <w:sz w:val="24"/>
+          <w:u w:val="single"/>
+        </w:rPr>
+      </w:pPr>
+      <w:r>
+        <w:rPr>
+          <w:rFonts w:ascii="Times New Roman" w:hAnsi="Times New Roman"/>
+          <w:sz w:val="24"/>
+        </w:rPr>
+        <w:tab/>
+      </w:r>
+      <w:r>
+        <w:rPr>
+          <w:rFonts w:ascii="Times New Roman" w:hAnsi="Times New Roman"/>
+          <w:sz w:val="24"/>
+        </w:rPr>
+        <w:tab/>
+      </w:r>
+      <w:r>
+        <w:rPr>
+          <w:rFonts w:ascii="Times New Roman" w:hAnsi="Times New Roman"/>
+          <w:sz w:val="24"/>
+        </w:rPr>
+        <w:tab/>
+      </w:r>
+      <w:r>
+        <w:rPr>
+          <w:rFonts w:ascii="Times New Roman" w:hAnsi="Times New Roman"/>
+          <w:sz w:val="24"/>
+        </w:rPr>
+        <w:tab/>
+      </w:r>
+      <w:r>
+        <w:rPr>
+          <w:rFonts w:ascii="Times New Roman" w:hAnsi="Times New Roman"/>
+          <w:sz w:val="24"/>
+        </w:rPr>
+        <w:tab/>
+      </w:r>
+      <w:r>
+        <w:rPr>
+          <w:rFonts w:ascii="Times New Roman" w:hAnsi="Times New Roman"/>
+          <w:sz w:val="24"/>
+        </w:rPr>
+        <w:tab/>
+      </w:r>
+      <w:r>
+        <w:rPr>
+          <w:rFonts w:ascii="Times New Roman" w:hAnsi="Times New Roman"/>
+          <w:sz w:val="24"/>
+        </w:rPr>
+        <w:tab/>
+      </w:r>
+      <w:r>
+        <w:rPr>
+          <w:rFonts w:ascii="Times New Roman" w:hAnsi="Times New Roman"/>
+          <w:sz w:val="24"/>
+        </w:rPr>
+        <w:t xml:space="preserve">TIN </w:t>
+      </w:r>
+      <w:r>
+        <w:rPr>
+          <w:rFonts w:hint="default" w:ascii="Times New Roman" w:hAnsi="Times New Roman"/>
+          <w:sz w:val="24"/>
+          <w:u w:val="single"/>
+          <w:lang w:val="en-US"/>
+        </w:rPr>
+        <w:t>${</w:t>
+      </w:r>
+      <w:r>
+        <w:rPr>
+          <w:rFonts w:hint="default"/>
+          <w:sz w:val="24"/>
+          <w:u w:val="single"/>
+          <w:lang w:val="en-US"/>
+        </w:rPr>
+        <w:t>ApplicantTinNumber</w:t>
+      </w:r>
+      <w:r>
+        <w:rPr>
+          <w:rFonts w:hint="default" w:ascii="Times New Roman" w:hAnsi="Times New Roman"/>
+          <w:sz w:val="24"/>
+          <w:u w:val="single"/>
+          <w:lang w:val="en-US"/>
+        </w:rPr>
+        <w:t>}</w:t>
+      </w:r>
+    </w:p>
+    <w:p>
+      <w:pPr>
+        <w:jc w:val="both"/>
+        <w:rPr>
+          <w:rFonts w:ascii="Times New Roman" w:hAnsi="Times New Roman"/>
+          <w:sz w:val="24"/>
+        </w:rPr>
+      </w:pPr>
+    </w:p>
+    <w:p>
+      <w:pPr>
+        <w:jc w:val="both"/>
+        <w:rPr>
+          <w:rFonts w:ascii="Times New Roman" w:hAnsi="Times New Roman"/>
+          <w:sz w:val="24"/>
+        </w:rPr>
+      </w:pPr>
+    </w:p>
+    <w:p>
+      <w:pPr>
+        <w:jc w:val="left"/>
+        <w:rPr>
+          <w:rFonts w:ascii="Times New Roman" w:hAnsi="Times New Roman"/>
+          <w:sz w:val="24"/>
+        </w:rPr>
+      </w:pPr>
+    </w:p>
+    <w:p>
+      <w:pPr>
+        <w:ind w:firstLine="3240" w:firstLineChars="1350"/>
+        <w:jc w:val="both"/>
+        <w:rPr>
+          <w:rFonts w:hint="default" w:ascii="Times New Roman" w:hAnsi="Times New Roman"/>
+          <w:sz w:val="24"/>
+          <w:lang w:val="en-US"/>
+        </w:rPr>
+      </w:pPr>
       <w:bookmarkStart w:id="0" w:name="_GoBack"/>
       <w:bookmarkEnd w:id="0"/>
-    </w:p>
-    <w:p>
-      <w:pPr>
-        <w:ind w:left="1440" w:hanging="720"/>
-        <w:jc w:val="both"/>
-        <w:rPr>
-          <w:rFonts w:ascii="Times New Roman" w:hAnsi="Times New Roman"/>
-          <w:sz w:val="24"/>
-        </w:rPr>
-      </w:pPr>
-      <w:r>
-        <w:rPr>
-          <w:rFonts w:ascii="Times New Roman" w:hAnsi="Times New Roman"/>
-          <w:sz w:val="24"/>
-        </w:rPr>
-        <w:tab/>
-      </w:r>
-      <w:r>
-        <w:rPr>
-          <w:rFonts w:ascii="Times New Roman" w:hAnsi="Times New Roman"/>
-          <w:sz w:val="24"/>
-        </w:rPr>
-        <w:t xml:space="preserve">(indicate civil status and if married, give name and citizenship of spouse) </w:t>
-      </w:r>
-    </w:p>
-    <w:p>
-      <w:pPr>
-        <w:jc w:val="both"/>
-        <w:rPr>
-          <w:rFonts w:ascii="Times New Roman" w:hAnsi="Times New Roman"/>
-          <w:sz w:val="24"/>
-        </w:rPr>
-      </w:pPr>
-    </w:p>
-    <w:p>
-      <w:pPr>
-        <w:ind w:left="1440" w:hanging="720"/>
-        <w:jc w:val="both"/>
-        <w:rPr>
-          <w:rFonts w:ascii="Times New Roman" w:hAnsi="Times New Roman"/>
-          <w:sz w:val="24"/>
-        </w:rPr>
-      </w:pPr>
-      <w:r>
-        <w:rPr>
-          <w:rFonts w:ascii="Times New Roman" w:hAnsi="Times New Roman"/>
-          <w:sz w:val="24"/>
-        </w:rPr>
-        <w:t>O</w:t>
-      </w:r>
-      <w:r>
-        <w:rPr>
-          <w:rFonts w:ascii="Times New Roman" w:hAnsi="Times New Roman"/>
-          <w:sz w:val="24"/>
-        </w:rPr>
-        <w:tab/>
-      </w:r>
-      <w:r>
-        <w:rPr>
-          <w:rFonts w:ascii="Times New Roman" w:hAnsi="Times New Roman"/>
-          <w:sz w:val="24"/>
-        </w:rPr>
-        <w:t>In the case of partnership or corporation, must be duly registered and incorporated under the laws of, and authorized to transact business  in the Philippines,   at least sixty per  centum (60%) of the capital stock of this partnership, corporation shall be owned and held by citizens of the Philippines.  A certified copy of the SEC Registration, Articles of Partnership  or Incorporation shall be submitted herewith.</w:t>
-      </w:r>
-    </w:p>
-    <w:p>
-      <w:pPr>
-        <w:jc w:val="both"/>
-        <w:rPr>
-          <w:rFonts w:ascii="Times New Roman" w:hAnsi="Times New Roman"/>
-          <w:sz w:val="24"/>
-        </w:rPr>
-      </w:pPr>
-    </w:p>
-    <w:p>
-      <w:pPr>
-        <w:jc w:val="both"/>
-        <w:rPr>
-          <w:rFonts w:ascii="Times New Roman" w:hAnsi="Times New Roman"/>
-          <w:sz w:val="24"/>
-        </w:rPr>
-      </w:pPr>
-      <w:r>
-        <w:rPr>
-          <w:rFonts w:ascii="Times New Roman" w:hAnsi="Times New Roman"/>
-          <w:sz w:val="24"/>
-        </w:rPr>
-        <w:t>Attached also are the following supporting papers:</w:t>
-      </w:r>
-    </w:p>
-    <w:p>
-      <w:pPr>
-        <w:jc w:val="both"/>
-        <w:rPr>
-          <w:rFonts w:ascii="Times New Roman" w:hAnsi="Times New Roman"/>
-          <w:sz w:val="24"/>
-        </w:rPr>
-      </w:pPr>
-    </w:p>
-    <w:p>
-      <w:pPr>
-        <w:ind w:left="720" w:hanging="720"/>
-        <w:jc w:val="both"/>
-        <w:rPr>
-          <w:rFonts w:ascii="Times New Roman" w:hAnsi="Times New Roman"/>
-          <w:sz w:val="24"/>
-        </w:rPr>
-      </w:pPr>
-      <w:r>
-        <w:rPr>
-          <w:rFonts w:ascii="Times New Roman" w:hAnsi="Times New Roman"/>
-          <w:sz w:val="24"/>
-        </w:rPr>
-        <w:t>O</w:t>
-      </w:r>
-      <w:r>
-        <w:rPr>
-          <w:rFonts w:ascii="Times New Roman" w:hAnsi="Times New Roman"/>
-          <w:sz w:val="24"/>
-        </w:rPr>
-        <w:tab/>
-      </w:r>
-      <w:r>
-        <w:rPr>
-          <w:rFonts w:ascii="Times New Roman" w:hAnsi="Times New Roman"/>
-          <w:sz w:val="24"/>
-        </w:rPr>
-        <w:t>Clearance,  when required, from the Bureau of Public Works, Bureau of Public Highways, National Power Corporation, National Irrigation Administration and/or other government  agencies, that the proposed excavations in the area  applied for will not adversely affect or cause damage to existing  public and private properties, multipurpose dams, reservoirs, seawalls, dikes, bridges, buildings, highways and other infrastructures;</w:t>
-      </w:r>
-    </w:p>
-    <w:p>
-      <w:pPr>
-        <w:ind w:left="1440" w:hanging="1440"/>
-        <w:jc w:val="both"/>
-        <w:rPr>
-          <w:rFonts w:ascii="Times New Roman" w:hAnsi="Times New Roman"/>
-          <w:sz w:val="24"/>
-        </w:rPr>
-      </w:pPr>
-    </w:p>
-    <w:p>
-      <w:pPr>
-        <w:ind w:left="720" w:hanging="720"/>
-        <w:jc w:val="both"/>
-        <w:rPr>
-          <w:rFonts w:ascii="Times New Roman" w:hAnsi="Times New Roman"/>
-          <w:sz w:val="24"/>
-        </w:rPr>
-      </w:pPr>
-      <w:r>
-        <w:rPr>
-          <w:rFonts w:ascii="Times New Roman" w:hAnsi="Times New Roman"/>
-          <w:sz w:val="24"/>
-        </w:rPr>
-        <w:t>O</w:t>
-      </w:r>
-      <w:r>
-        <w:rPr>
-          <w:rFonts w:ascii="Times New Roman" w:hAnsi="Times New Roman"/>
-          <w:sz w:val="24"/>
-        </w:rPr>
-        <w:tab/>
-      </w:r>
-      <w:r>
-        <w:rPr>
-          <w:rFonts w:ascii="Times New Roman" w:hAnsi="Times New Roman"/>
-          <w:sz w:val="24"/>
-        </w:rPr>
-        <w:t>Written consent of owners of the private lands adjoining the area that may be affected by excavations to be undertaken;</w:t>
-      </w:r>
-    </w:p>
-    <w:p>
-      <w:pPr>
-        <w:ind w:left="720" w:hanging="720"/>
-        <w:jc w:val="both"/>
-        <w:rPr>
-          <w:rFonts w:ascii="Times New Roman" w:hAnsi="Times New Roman"/>
-          <w:sz w:val="24"/>
-        </w:rPr>
-      </w:pPr>
-    </w:p>
-    <w:p>
-      <w:pPr>
-        <w:ind w:left="720" w:hanging="720"/>
-        <w:jc w:val="both"/>
-        <w:rPr>
-          <w:rFonts w:ascii="Times New Roman" w:hAnsi="Times New Roman"/>
-          <w:sz w:val="24"/>
-        </w:rPr>
-      </w:pPr>
-      <w:r>
-        <w:rPr>
-          <w:rFonts w:ascii="Times New Roman" w:hAnsi="Times New Roman"/>
-          <w:sz w:val="24"/>
-        </w:rPr>
-        <w:t>O</w:t>
-      </w:r>
-      <w:r>
-        <w:rPr>
-          <w:rFonts w:ascii="Times New Roman" w:hAnsi="Times New Roman"/>
-          <w:sz w:val="24"/>
-        </w:rPr>
-        <w:tab/>
-      </w:r>
-      <w:r>
-        <w:rPr>
-          <w:rFonts w:ascii="Times New Roman" w:hAnsi="Times New Roman"/>
-          <w:sz w:val="24"/>
-        </w:rPr>
-        <w:t>Commitment to secure Environmental Compliance Certificate (ECC) prior to extraction.</w:t>
-      </w:r>
-    </w:p>
-    <w:p>
-      <w:pPr>
-        <w:ind w:left="1440" w:hanging="1440"/>
-        <w:jc w:val="both"/>
-        <w:rPr>
-          <w:rFonts w:ascii="Times New Roman" w:hAnsi="Times New Roman"/>
-          <w:sz w:val="24"/>
-        </w:rPr>
-      </w:pPr>
-    </w:p>
-    <w:p>
-      <w:pPr>
-        <w:jc w:val="both"/>
-        <w:rPr>
-          <w:rFonts w:ascii="Times New Roman" w:hAnsi="Times New Roman"/>
-          <w:sz w:val="24"/>
-        </w:rPr>
-      </w:pPr>
-      <w:r>
-        <w:rPr>
-          <w:rFonts w:ascii="Times New Roman" w:hAnsi="Times New Roman"/>
-          <w:sz w:val="24"/>
-        </w:rPr>
-        <w:tab/>
-      </w:r>
-      <w:r>
-        <w:rPr>
-          <w:rFonts w:ascii="Times New Roman" w:hAnsi="Times New Roman"/>
-          <w:sz w:val="24"/>
-        </w:rPr>
-        <w:t xml:space="preserve">The applicant binds himself/herself or itself to pay the amount of </w:t>
-      </w:r>
-      <w:r>
-        <w:rPr>
-          <w:rFonts w:hint="default" w:ascii="Times New Roman" w:hAnsi="Times New Roman"/>
-          <w:sz w:val="24"/>
-          <w:u w:val="single"/>
-          <w:lang w:val="en-US"/>
-        </w:rPr>
-        <w:t>${</w:t>
-      </w:r>
       <w:r>
         <w:rPr>
           <w:rFonts w:hint="default"/>
           <w:sz w:val="24"/>
-          <w:u w:val="single"/>
-          <w:lang w:val="en-US"/>
-        </w:rPr>
-        <w:t>AmountInWord</w:t>
-      </w:r>
-      <w:r>
-        <w:rPr>
-          <w:rFonts w:hint="default" w:ascii="Times New Roman" w:hAnsi="Times New Roman"/>
-          <w:sz w:val="24"/>
-          <w:u w:val="single"/>
-          <w:lang w:val="en-US"/>
-        </w:rPr>
-        <w:t>}</w:t>
-      </w:r>
-      <w:r>
-        <w:rPr>
-          <w:rFonts w:ascii="Times New Roman" w:hAnsi="Times New Roman"/>
-          <w:sz w:val="24"/>
-        </w:rPr>
-        <w:t xml:space="preserve"> (</w:t>
-      </w:r>
-      <w:r>
-        <w:rPr>
-          <w:rFonts w:ascii="Times New Roman" w:hAnsi="Times New Roman"/>
-          <w:strike/>
-          <w:sz w:val="24"/>
-        </w:rPr>
-        <w:t>P</w:t>
-      </w:r>
-      <w:r>
-        <w:rPr>
-          <w:rFonts w:hint="default" w:ascii="Times New Roman" w:hAnsi="Times New Roman"/>
-          <w:sz w:val="24"/>
-          <w:u w:val="single"/>
-          <w:lang w:val="en-US"/>
-        </w:rPr>
-        <w:t>${</w:t>
-      </w:r>
-      <w:r>
-        <w:rPr>
-          <w:rFonts w:hint="default"/>
-          <w:sz w:val="24"/>
-          <w:u w:val="single"/>
-          <w:lang w:val="en-US"/>
-        </w:rPr>
-        <w:t>AmountInNumber</w:t>
-      </w:r>
-      <w:r>
-        <w:rPr>
-          <w:rFonts w:hint="default" w:ascii="Times New Roman" w:hAnsi="Times New Roman"/>
-          <w:sz w:val="24"/>
-          <w:u w:val="single"/>
-          <w:lang w:val="en-US"/>
-        </w:rPr>
-        <w:t>}</w:t>
-      </w:r>
-      <w:r>
-        <w:rPr>
-          <w:rFonts w:ascii="Times New Roman" w:hAnsi="Times New Roman"/>
-          <w:sz w:val="24"/>
-        </w:rPr>
-        <w:t xml:space="preserve">) covering the total fee for the materials applied for, and to file a </w:t>
-      </w:r>
-      <w:r>
-        <w:rPr>
-          <w:rFonts w:hint="default" w:ascii="Times New Roman" w:hAnsi="Times New Roman"/>
-          <w:sz w:val="24"/>
-          <w:u w:val="single"/>
-          <w:lang w:val="en-US"/>
-        </w:rPr>
-        <w:t>${</w:t>
-      </w:r>
-      <w:r>
-        <w:rPr>
-          <w:rFonts w:hint="default"/>
-          <w:sz w:val="24"/>
-          <w:u w:val="single"/>
-          <w:lang w:val="en-US"/>
-        </w:rPr>
-        <w:t>BondName</w:t>
-      </w:r>
-      <w:r>
-        <w:rPr>
-          <w:rFonts w:hint="default" w:ascii="Times New Roman" w:hAnsi="Times New Roman"/>
-          <w:sz w:val="24"/>
-          <w:u w:val="single"/>
-          <w:lang w:val="en-US"/>
-        </w:rPr>
-        <w:t>}</w:t>
-      </w:r>
-      <w:r>
-        <w:rPr>
-          <w:rFonts w:ascii="Times New Roman" w:hAnsi="Times New Roman"/>
-          <w:sz w:val="24"/>
-        </w:rPr>
-        <w:t xml:space="preserve"> bond in the amount of </w:t>
-      </w:r>
-      <w:r>
-        <w:rPr>
-          <w:rFonts w:hint="default" w:ascii="Times New Roman" w:hAnsi="Times New Roman"/>
-          <w:sz w:val="24"/>
-          <w:u w:val="single"/>
-          <w:lang w:val="en-US"/>
-        </w:rPr>
-        <w:t>${</w:t>
-      </w:r>
-      <w:r>
-        <w:rPr>
-          <w:rFonts w:hint="default"/>
-          <w:sz w:val="24"/>
-          <w:u w:val="single"/>
-          <w:lang w:val="en-US"/>
-        </w:rPr>
-        <w:t>BondAmountWord</w:t>
-      </w:r>
-      <w:r>
-        <w:rPr>
-          <w:rFonts w:hint="default" w:ascii="Times New Roman" w:hAnsi="Times New Roman"/>
-          <w:sz w:val="24"/>
-          <w:u w:val="single"/>
-          <w:lang w:val="en-US"/>
-        </w:rPr>
-        <w:t>}</w:t>
-      </w:r>
-      <w:r>
-        <w:rPr>
-          <w:rFonts w:ascii="Times New Roman" w:hAnsi="Times New Roman"/>
-          <w:sz w:val="24"/>
-        </w:rPr>
-        <w:t xml:space="preserve">, (surety, cash or personal) ( </w:t>
-      </w:r>
-      <w:r>
-        <w:rPr>
-          <w:rFonts w:ascii="Times New Roman" w:hAnsi="Times New Roman"/>
-          <w:strike/>
-          <w:sz w:val="24"/>
-        </w:rPr>
-        <w:t>P</w:t>
-      </w:r>
-      <w:r>
-        <w:rPr>
-          <w:rFonts w:hint="default" w:ascii="Times New Roman" w:hAnsi="Times New Roman"/>
-          <w:sz w:val="24"/>
-          <w:u w:val="single"/>
-          <w:lang w:val="en-US"/>
-        </w:rPr>
-        <w:t>${</w:t>
-      </w:r>
-      <w:r>
-        <w:rPr>
-          <w:rFonts w:hint="default"/>
-          <w:sz w:val="24"/>
-          <w:u w:val="single"/>
-          <w:lang w:val="en-US"/>
-        </w:rPr>
-        <w:t>BondAmountNumber</w:t>
-      </w:r>
-      <w:r>
-        <w:rPr>
-          <w:rFonts w:hint="default" w:ascii="Times New Roman" w:hAnsi="Times New Roman"/>
-          <w:sz w:val="24"/>
-          <w:u w:val="single"/>
-          <w:lang w:val="en-US"/>
-        </w:rPr>
-        <w:t>}</w:t>
-      </w:r>
-      <w:r>
-        <w:rPr>
-          <w:rFonts w:ascii="Times New Roman" w:hAnsi="Times New Roman"/>
-          <w:sz w:val="24"/>
-        </w:rPr>
-        <w:t>); and to strictly and fully comply with all existing laws, rules and regulations, orders, instructions, resolutions and ordinances governing the filing and approval of application and the granting of the permits for the extraction and/or disposition of the materials herein applied for.  Failure to do so shall cause the cancellation of the permit and the confiscation and forfeiture of the bond and all the payments, if any, made by the permittee, in favor of the Government.  This application is made for the exclusive use and benefit of the applicant and not either directly or indirectly, for the benefit of any other person, corporation, partnership, and for the sole purpose of removing and disposing of the said materials in the manner stated above.  All the statements in this application shall be considered as integral part of the permit to be issued to him.</w:t>
-      </w:r>
-    </w:p>
-    <w:p>
-      <w:pPr>
-        <w:jc w:val="both"/>
-        <w:rPr>
-          <w:rFonts w:ascii="Times New Roman" w:hAnsi="Times New Roman"/>
-          <w:sz w:val="24"/>
-        </w:rPr>
-      </w:pPr>
-    </w:p>
-    <w:p>
-      <w:pPr>
-        <w:jc w:val="both"/>
-        <w:rPr>
-          <w:rFonts w:ascii="Times New Roman" w:hAnsi="Times New Roman"/>
-          <w:sz w:val="24"/>
-        </w:rPr>
-      </w:pPr>
-      <w:r>
-        <w:rPr>
-          <w:rFonts w:ascii="Times New Roman" w:hAnsi="Times New Roman"/>
-          <w:sz w:val="24"/>
-        </w:rPr>
-        <w:tab/>
-      </w:r>
-      <w:r>
-        <w:rPr>
-          <w:rFonts w:ascii="Times New Roman" w:hAnsi="Times New Roman"/>
-          <w:sz w:val="24"/>
-        </w:rPr>
-        <w:t>The above statements are true and correct to my best knowledge and belief.</w:t>
-      </w:r>
-    </w:p>
-    <w:p>
-      <w:pPr>
-        <w:jc w:val="both"/>
-        <w:rPr>
-          <w:rFonts w:ascii="Times New Roman" w:hAnsi="Times New Roman"/>
-          <w:sz w:val="24"/>
-        </w:rPr>
-      </w:pPr>
-    </w:p>
-    <w:p>
-      <w:pPr>
-        <w:jc w:val="both"/>
-        <w:rPr>
-          <w:rFonts w:ascii="Times New Roman" w:hAnsi="Times New Roman"/>
-          <w:sz w:val="24"/>
-        </w:rPr>
-      </w:pPr>
-      <w:r>
-        <w:rPr>
-          <w:rFonts w:ascii="Times New Roman" w:hAnsi="Times New Roman"/>
-          <w:sz w:val="24"/>
-        </w:rPr>
-        <w:tab/>
-      </w:r>
-      <w:r>
-        <w:rPr>
-          <w:rFonts w:ascii="Times New Roman" w:hAnsi="Times New Roman"/>
-          <w:sz w:val="24"/>
-        </w:rPr>
-        <w:tab/>
-      </w:r>
-      <w:r>
-        <w:rPr>
-          <w:rFonts w:ascii="Times New Roman" w:hAnsi="Times New Roman"/>
-          <w:sz w:val="24"/>
-        </w:rPr>
-        <w:tab/>
-      </w:r>
-      <w:r>
-        <w:rPr>
-          <w:rFonts w:ascii="Times New Roman" w:hAnsi="Times New Roman"/>
-          <w:sz w:val="24"/>
-        </w:rPr>
-        <w:tab/>
-      </w:r>
-      <w:r>
-        <w:rPr>
-          <w:rFonts w:ascii="Times New Roman" w:hAnsi="Times New Roman"/>
-          <w:sz w:val="24"/>
-        </w:rPr>
-        <w:tab/>
-      </w:r>
-      <w:r>
-        <w:rPr>
-          <w:rFonts w:ascii="Times New Roman" w:hAnsi="Times New Roman"/>
-          <w:sz w:val="24"/>
-        </w:rPr>
-        <w:tab/>
-      </w:r>
-      <w:r>
-        <w:rPr>
-          <w:rFonts w:ascii="Times New Roman" w:hAnsi="Times New Roman"/>
-          <w:sz w:val="24"/>
-        </w:rPr>
-        <w:tab/>
-      </w:r>
-      <w:r>
-        <w:rPr>
-          <w:rFonts w:ascii="Times New Roman" w:hAnsi="Times New Roman"/>
-          <w:sz w:val="24"/>
-        </w:rPr>
-        <w:t>Very respectfully,</w:t>
-      </w:r>
-    </w:p>
-    <w:p>
-      <w:pPr>
-        <w:jc w:val="both"/>
-        <w:rPr>
-          <w:rFonts w:ascii="Times New Roman" w:hAnsi="Times New Roman"/>
-          <w:sz w:val="24"/>
-        </w:rPr>
-      </w:pPr>
-    </w:p>
-    <w:p>
-      <w:pPr>
-        <w:jc w:val="both"/>
-        <w:rPr>
-          <w:rFonts w:ascii="Times New Roman" w:hAnsi="Times New Roman"/>
-          <w:sz w:val="24"/>
-        </w:rPr>
-      </w:pPr>
-      <w:r>
-        <w:rPr>
-          <w:rFonts w:ascii="Times New Roman" w:hAnsi="Times New Roman"/>
-          <w:sz w:val="24"/>
-        </w:rPr>
-        <w:tab/>
-      </w:r>
-      <w:r>
-        <w:rPr>
-          <w:rFonts w:ascii="Times New Roman" w:hAnsi="Times New Roman"/>
-          <w:sz w:val="24"/>
-        </w:rPr>
-        <w:tab/>
-      </w:r>
-      <w:r>
-        <w:rPr>
-          <w:rFonts w:ascii="Times New Roman" w:hAnsi="Times New Roman"/>
-          <w:sz w:val="24"/>
-        </w:rPr>
-        <w:tab/>
-      </w:r>
-      <w:r>
-        <w:rPr>
-          <w:rFonts w:ascii="Times New Roman" w:hAnsi="Times New Roman"/>
-          <w:sz w:val="24"/>
-        </w:rPr>
-        <w:tab/>
-      </w:r>
-      <w:r>
-        <w:rPr>
-          <w:rFonts w:ascii="Times New Roman" w:hAnsi="Times New Roman"/>
-          <w:sz w:val="24"/>
-        </w:rPr>
-        <w:tab/>
-      </w:r>
-      <w:r>
-        <w:rPr>
-          <w:rFonts w:ascii="Times New Roman" w:hAnsi="Times New Roman"/>
-          <w:sz w:val="24"/>
-        </w:rPr>
-        <w:tab/>
-      </w:r>
-      <w:r>
-        <w:rPr>
-          <w:rFonts w:ascii="Times New Roman" w:hAnsi="Times New Roman"/>
-          <w:sz w:val="24"/>
-        </w:rPr>
-        <w:tab/>
-      </w:r>
-      <w:r>
-        <w:rPr>
-          <w:rFonts w:hint="default" w:ascii="Times New Roman" w:hAnsi="Times New Roman"/>
-          <w:sz w:val="24"/>
-          <w:u w:val="single"/>
-          <w:lang w:val="en-US"/>
-        </w:rPr>
-        <w:t>${</w:t>
-      </w:r>
-      <w:r>
-        <w:rPr>
-          <w:rFonts w:hint="default"/>
-          <w:sz w:val="24"/>
-          <w:u w:val="single"/>
-          <w:lang w:val="en-US"/>
-        </w:rPr>
-        <w:t>ApplicantName</w:t>
-      </w:r>
-      <w:r>
-        <w:rPr>
-          <w:rFonts w:hint="default" w:ascii="Times New Roman" w:hAnsi="Times New Roman"/>
-          <w:sz w:val="24"/>
-          <w:u w:val="single"/>
-          <w:lang w:val="en-US"/>
-        </w:rPr>
-        <w:t>}</w:t>
-      </w:r>
-    </w:p>
-    <w:p>
-      <w:pPr>
-        <w:jc w:val="both"/>
-        <w:rPr>
-          <w:rFonts w:ascii="Times New Roman" w:hAnsi="Times New Roman"/>
-          <w:sz w:val="24"/>
-        </w:rPr>
-      </w:pPr>
-      <w:r>
-        <w:rPr>
-          <w:rFonts w:ascii="Times New Roman" w:hAnsi="Times New Roman"/>
-          <w:sz w:val="24"/>
-        </w:rPr>
-        <w:tab/>
-      </w:r>
-      <w:r>
-        <w:rPr>
-          <w:rFonts w:ascii="Times New Roman" w:hAnsi="Times New Roman"/>
-          <w:sz w:val="24"/>
-        </w:rPr>
-        <w:tab/>
-      </w:r>
-      <w:r>
-        <w:rPr>
-          <w:rFonts w:ascii="Times New Roman" w:hAnsi="Times New Roman"/>
-          <w:sz w:val="24"/>
-        </w:rPr>
-        <w:tab/>
-      </w:r>
-      <w:r>
-        <w:rPr>
-          <w:rFonts w:ascii="Times New Roman" w:hAnsi="Times New Roman"/>
-          <w:sz w:val="24"/>
-        </w:rPr>
-        <w:tab/>
-      </w:r>
-      <w:r>
-        <w:rPr>
-          <w:rFonts w:ascii="Times New Roman" w:hAnsi="Times New Roman"/>
-          <w:sz w:val="24"/>
-        </w:rPr>
-        <w:tab/>
-      </w:r>
-      <w:r>
-        <w:rPr>
-          <w:rFonts w:ascii="Times New Roman" w:hAnsi="Times New Roman"/>
-          <w:sz w:val="24"/>
-        </w:rPr>
-        <w:tab/>
-      </w:r>
-      <w:r>
-        <w:rPr>
-          <w:rFonts w:ascii="Times New Roman" w:hAnsi="Times New Roman"/>
-          <w:sz w:val="24"/>
-        </w:rPr>
-        <w:tab/>
-      </w:r>
-      <w:r>
-        <w:rPr>
-          <w:rFonts w:ascii="Times New Roman" w:hAnsi="Times New Roman"/>
-          <w:sz w:val="24"/>
-        </w:rPr>
-        <w:tab/>
-      </w:r>
-      <w:r>
-        <w:rPr>
-          <w:rFonts w:ascii="Times New Roman" w:hAnsi="Times New Roman"/>
-          <w:sz w:val="24"/>
-        </w:rPr>
-        <w:t>(Applicant)</w:t>
-      </w:r>
-    </w:p>
-    <w:p>
-      <w:pPr>
-        <w:jc w:val="both"/>
-        <w:rPr>
-          <w:rFonts w:ascii="Times New Roman" w:hAnsi="Times New Roman"/>
-          <w:sz w:val="24"/>
-          <w:u w:val="single"/>
-        </w:rPr>
-      </w:pPr>
-      <w:r>
-        <w:rPr>
-          <w:rFonts w:ascii="Times New Roman" w:hAnsi="Times New Roman"/>
-          <w:sz w:val="24"/>
-        </w:rPr>
-        <w:tab/>
-      </w:r>
-      <w:r>
-        <w:rPr>
-          <w:rFonts w:ascii="Times New Roman" w:hAnsi="Times New Roman"/>
-          <w:sz w:val="24"/>
-        </w:rPr>
-        <w:tab/>
-      </w:r>
-      <w:r>
-        <w:rPr>
-          <w:rFonts w:ascii="Times New Roman" w:hAnsi="Times New Roman"/>
-          <w:sz w:val="24"/>
-        </w:rPr>
-        <w:tab/>
-      </w:r>
-      <w:r>
-        <w:rPr>
-          <w:rFonts w:ascii="Times New Roman" w:hAnsi="Times New Roman"/>
-          <w:sz w:val="24"/>
-        </w:rPr>
-        <w:tab/>
-      </w:r>
-      <w:r>
-        <w:rPr>
-          <w:rFonts w:ascii="Times New Roman" w:hAnsi="Times New Roman"/>
-          <w:sz w:val="24"/>
-        </w:rPr>
-        <w:tab/>
-      </w:r>
-      <w:r>
-        <w:rPr>
-          <w:rFonts w:ascii="Times New Roman" w:hAnsi="Times New Roman"/>
-          <w:sz w:val="24"/>
-        </w:rPr>
-        <w:tab/>
-      </w:r>
-      <w:r>
-        <w:rPr>
-          <w:rFonts w:ascii="Times New Roman" w:hAnsi="Times New Roman"/>
-          <w:sz w:val="24"/>
-        </w:rPr>
-        <w:tab/>
-      </w:r>
-      <w:r>
-        <w:rPr>
-          <w:rFonts w:ascii="Times New Roman" w:hAnsi="Times New Roman"/>
-          <w:sz w:val="24"/>
-        </w:rPr>
-        <w:t xml:space="preserve">TIN </w:t>
-      </w:r>
-      <w:r>
-        <w:rPr>
-          <w:rFonts w:hint="default" w:ascii="Times New Roman" w:hAnsi="Times New Roman"/>
-          <w:sz w:val="24"/>
-          <w:u w:val="single"/>
-          <w:lang w:val="en-US"/>
-        </w:rPr>
-        <w:t>${</w:t>
-      </w:r>
-      <w:r>
-        <w:rPr>
-          <w:rFonts w:hint="default"/>
-          <w:sz w:val="24"/>
-          <w:u w:val="single"/>
-          <w:lang w:val="en-US"/>
-        </w:rPr>
-        <w:t>ApplicantTinNumber</w:t>
-      </w:r>
-      <w:r>
-        <w:rPr>
-          <w:rFonts w:hint="default" w:ascii="Times New Roman" w:hAnsi="Times New Roman"/>
-          <w:sz w:val="24"/>
-          <w:u w:val="single"/>
-          <w:lang w:val="en-US"/>
-        </w:rPr>
-        <w:t>}</w:t>
-      </w:r>
-    </w:p>
-    <w:p>
-      <w:pPr>
-        <w:jc w:val="both"/>
-        <w:rPr>
-          <w:rFonts w:ascii="Times New Roman" w:hAnsi="Times New Roman"/>
-          <w:sz w:val="24"/>
-        </w:rPr>
-      </w:pPr>
-    </w:p>
-    <w:p>
-      <w:pPr>
-        <w:jc w:val="both"/>
-        <w:rPr>
-          <w:rFonts w:ascii="Times New Roman" w:hAnsi="Times New Roman"/>
-          <w:sz w:val="24"/>
-        </w:rPr>
-      </w:pPr>
-    </w:p>
-    <w:p>
-      <w:pPr>
-        <w:jc w:val="both"/>
-        <w:rPr>
-          <w:rFonts w:ascii="Times New Roman" w:hAnsi="Times New Roman"/>
-          <w:sz w:val="24"/>
-        </w:rPr>
-      </w:pPr>
-    </w:p>
-    <w:p>
-      <w:pPr>
-        <w:jc w:val="both"/>
-        <w:rPr>
-          <w:rFonts w:ascii="Times New Roman" w:hAnsi="Times New Roman"/>
-          <w:sz w:val="24"/>
-        </w:rPr>
-      </w:pPr>
-    </w:p>
-    <w:p>
-      <w:pPr>
-        <w:jc w:val="both"/>
-        <w:rPr>
-          <w:rFonts w:ascii="Times New Roman" w:hAnsi="Times New Roman"/>
-          <w:sz w:val="24"/>
-        </w:rPr>
-      </w:pPr>
-    </w:p>
-    <w:p>
-      <w:pPr>
-        <w:jc w:val="both"/>
-        <w:rPr>
-          <w:rFonts w:ascii="Times New Roman" w:hAnsi="Times New Roman"/>
-          <w:sz w:val="24"/>
-        </w:rPr>
-      </w:pPr>
-    </w:p>
-    <w:p>
-      <w:pPr>
-        <w:jc w:val="both"/>
-        <w:rPr>
-          <w:rFonts w:ascii="Times New Roman" w:hAnsi="Times New Roman"/>
-          <w:sz w:val="24"/>
-        </w:rPr>
-      </w:pPr>
-    </w:p>
-    <w:p>
-      <w:pPr>
-        <w:jc w:val="both"/>
-        <w:rPr>
-          <w:rFonts w:ascii="Times New Roman" w:hAnsi="Times New Roman"/>
-          <w:sz w:val="24"/>
-        </w:rPr>
-      </w:pPr>
-    </w:p>
-    <w:p>
-      <w:pPr>
-        <w:jc w:val="both"/>
-        <w:rPr>
-          <w:rFonts w:ascii="Times New Roman" w:hAnsi="Times New Roman"/>
-          <w:sz w:val="24"/>
-        </w:rPr>
-      </w:pPr>
-    </w:p>
-    <w:p>
-      <w:pPr>
-        <w:jc w:val="both"/>
-        <w:rPr>
-          <w:rFonts w:ascii="Times New Roman" w:hAnsi="Times New Roman"/>
-          <w:sz w:val="24"/>
-        </w:rPr>
-      </w:pPr>
-    </w:p>
-    <w:p>
-      <w:pPr>
-        <w:jc w:val="both"/>
-        <w:rPr>
-          <w:rFonts w:ascii="Times New Roman" w:hAnsi="Times New Roman"/>
-          <w:sz w:val="24"/>
-        </w:rPr>
-      </w:pPr>
-    </w:p>
-    <w:p>
-      <w:pPr>
-        <w:jc w:val="both"/>
-        <w:rPr>
-          <w:rFonts w:ascii="Times New Roman" w:hAnsi="Times New Roman"/>
-          <w:sz w:val="24"/>
-        </w:rPr>
-      </w:pPr>
-    </w:p>
-    <w:p>
-      <w:pPr>
-        <w:jc w:val="both"/>
-        <w:rPr>
-          <w:rFonts w:ascii="Times New Roman" w:hAnsi="Times New Roman"/>
-          <w:sz w:val="24"/>
-        </w:rPr>
-      </w:pPr>
-    </w:p>
-    <w:p>
-      <w:pPr>
-        <w:jc w:val="both"/>
+          <w:lang w:val="en-US"/>
+        </w:rPr>
+        <w:t>${qrHeading}</w:t>
+      </w:r>
+    </w:p>
+    <w:tbl>
+      <w:tblPr>
+        <w:tblStyle w:val="8"/>
+        <w:tblpPr w:leftFromText="181" w:rightFromText="181" w:vertAnchor="text" w:horzAnchor="page" w:tblpXSpec="center" w:tblpY="216"/>
+        <w:tblOverlap w:val="never"/>
+        <w:tblW w:w="0" w:type="auto"/>
+        <w:jc w:val="center"/>
+        <w:tblBorders>
+          <w:top w:val="triple" w:color="auto" w:sz="4" w:space="0"/>
+          <w:left w:val="triple" w:color="auto" w:sz="4" w:space="0"/>
+          <w:bottom w:val="triple" w:color="auto" w:sz="4" w:space="0"/>
+          <w:right w:val="triple" w:color="auto" w:sz="4" w:space="0"/>
+          <w:insideH w:val="single" w:color="auto" w:sz="4" w:space="0"/>
+          <w:insideV w:val="single" w:color="auto" w:sz="4" w:space="0"/>
+        </w:tblBorders>
+        <w:tblLayout w:type="fixed"/>
+        <w:tblCellMar>
+          <w:top w:w="0" w:type="dxa"/>
+          <w:left w:w="108" w:type="dxa"/>
+          <w:bottom w:w="0" w:type="dxa"/>
+          <w:right w:w="108" w:type="dxa"/>
+        </w:tblCellMar>
+      </w:tblPr>
+      <w:tblGrid>
+        <w:gridCol w:w="3402"/>
+      </w:tblGrid>
+      <w:tr>
+        <w:tblPrEx>
+          <w:tblBorders>
+            <w:top w:val="triple" w:color="auto" w:sz="4" w:space="0"/>
+            <w:left w:val="triple" w:color="auto" w:sz="4" w:space="0"/>
+            <w:bottom w:val="triple" w:color="auto" w:sz="4" w:space="0"/>
+            <w:right w:val="triple" w:color="auto" w:sz="4" w:space="0"/>
+            <w:insideH w:val="single" w:color="auto" w:sz="4" w:space="0"/>
+            <w:insideV w:val="single" w:color="auto" w:sz="4" w:space="0"/>
+          </w:tblBorders>
+          <w:tblCellMar>
+            <w:top w:w="0" w:type="dxa"/>
+            <w:left w:w="108" w:type="dxa"/>
+            <w:bottom w:w="0" w:type="dxa"/>
+            <w:right w:w="108" w:type="dxa"/>
+          </w:tblCellMar>
+        </w:tblPrEx>
+        <w:trPr>
+          <w:trHeight w:val="3402" w:hRule="exact"/>
+          <w:jc w:val="center"/>
+        </w:trPr>
+        <w:tc>
+          <w:tcPr>
+            <w:tcW w:w="3402" w:type="dxa"/>
+            <w:tcMar>
+              <w:top w:w="0" w:type="dxa"/>
+              <w:left w:w="0" w:type="dxa"/>
+              <w:bottom w:w="0" w:type="dxa"/>
+              <w:right w:w="0" w:type="dxa"/>
+            </w:tcMar>
+            <w:vAlign w:val="center"/>
+          </w:tcPr>
+          <w:p>
+            <w:pPr>
+              <w:jc w:val="center"/>
+              <w:rPr>
+                <w:rFonts w:hint="default" w:ascii="Times New Roman" w:hAnsi="Times New Roman"/>
+                <w:sz w:val="24"/>
+                <w:vertAlign w:val="baseline"/>
+                <w:lang w:val="en-US"/>
+              </w:rPr>
+            </w:pPr>
+            <w:r>
+              <w:rPr>
+                <w:rFonts w:hint="default"/>
+                <w:sz w:val="24"/>
+                <w:vertAlign w:val="baseline"/>
+                <w:lang w:val="en-US"/>
+              </w:rPr>
+              <w:t>${qrCode}</w:t>
+            </w:r>
+          </w:p>
+        </w:tc>
+      </w:tr>
+    </w:tbl>
+    <w:p>
+      <w:pPr>
+        <w:jc w:val="center"/>
+        <w:rPr>
+          <w:rFonts w:ascii="Times New Roman" w:hAnsi="Times New Roman"/>
+          <w:sz w:val="24"/>
+        </w:rPr>
+      </w:pPr>
+    </w:p>
+    <w:p>
+      <w:pPr>
+        <w:jc w:val="center"/>
+        <w:rPr>
+          <w:rFonts w:ascii="Times New Roman" w:hAnsi="Times New Roman"/>
+          <w:sz w:val="24"/>
+        </w:rPr>
+      </w:pPr>
+    </w:p>
+    <w:p>
+      <w:pPr>
+        <w:jc w:val="center"/>
+        <w:rPr>
+          <w:rFonts w:ascii="Times New Roman" w:hAnsi="Times New Roman"/>
+          <w:sz w:val="24"/>
+        </w:rPr>
+      </w:pPr>
+    </w:p>
+    <w:p>
+      <w:pPr>
+        <w:jc w:val="center"/>
+        <w:rPr>
+          <w:rFonts w:ascii="Times New Roman" w:hAnsi="Times New Roman"/>
+          <w:sz w:val="24"/>
+        </w:rPr>
+      </w:pPr>
+    </w:p>
+    <w:p>
+      <w:pPr>
+        <w:jc w:val="center"/>
+        <w:rPr>
+          <w:rFonts w:ascii="Times New Roman" w:hAnsi="Times New Roman"/>
+          <w:sz w:val="24"/>
+        </w:rPr>
+      </w:pPr>
+    </w:p>
+    <w:p>
+      <w:pPr>
+        <w:jc w:val="center"/>
+        <w:rPr>
+          <w:rFonts w:ascii="Times New Roman" w:hAnsi="Times New Roman"/>
+          <w:sz w:val="24"/>
+        </w:rPr>
+      </w:pPr>
+    </w:p>
+    <w:p>
+      <w:pPr>
+        <w:jc w:val="center"/>
+        <w:rPr>
+          <w:rFonts w:ascii="Times New Roman" w:hAnsi="Times New Roman"/>
+          <w:sz w:val="24"/>
+        </w:rPr>
+      </w:pPr>
+    </w:p>
+    <w:p>
+      <w:pPr>
+        <w:jc w:val="center"/>
+        <w:rPr>
+          <w:rFonts w:ascii="Times New Roman" w:hAnsi="Times New Roman"/>
+          <w:sz w:val="24"/>
+        </w:rPr>
+      </w:pPr>
+    </w:p>
+    <w:p>
+      <w:pPr>
+        <w:jc w:val="center"/>
+        <w:rPr>
+          <w:rFonts w:ascii="Times New Roman" w:hAnsi="Times New Roman"/>
+          <w:sz w:val="24"/>
+        </w:rPr>
+      </w:pPr>
+    </w:p>
+    <w:p>
+      <w:pPr>
+        <w:jc w:val="center"/>
+        <w:rPr>
+          <w:rFonts w:ascii="Times New Roman" w:hAnsi="Times New Roman"/>
+          <w:sz w:val="24"/>
+        </w:rPr>
+      </w:pPr>
+    </w:p>
+    <w:p>
+      <w:pPr>
+        <w:jc w:val="center"/>
+        <w:rPr>
+          <w:rFonts w:ascii="Times New Roman" w:hAnsi="Times New Roman"/>
+          <w:sz w:val="24"/>
+        </w:rPr>
+      </w:pPr>
+    </w:p>
+    <w:p>
+      <w:pPr>
+        <w:jc w:val="center"/>
+        <w:rPr>
+          <w:rFonts w:ascii="Times New Roman" w:hAnsi="Times New Roman"/>
+          <w:sz w:val="24"/>
+        </w:rPr>
+      </w:pPr>
+    </w:p>
+    <w:p>
+      <w:pPr>
+        <w:jc w:val="center"/>
+        <w:rPr>
+          <w:rFonts w:ascii="Times New Roman" w:hAnsi="Times New Roman"/>
+          <w:sz w:val="24"/>
+        </w:rPr>
+      </w:pPr>
+    </w:p>
+    <w:p>
+      <w:pPr>
+        <w:jc w:val="center"/>
+        <w:rPr>
+          <w:rFonts w:ascii="Times New Roman" w:hAnsi="Times New Roman"/>
+          <w:sz w:val="24"/>
+        </w:rPr>
+      </w:pPr>
+    </w:p>
+    <w:p>
+      <w:pPr>
+        <w:jc w:val="center"/>
+        <w:rPr>
+          <w:rFonts w:ascii="Times New Roman" w:hAnsi="Times New Roman"/>
+          <w:sz w:val="24"/>
+        </w:rPr>
+      </w:pPr>
+    </w:p>
+    <w:p>
+      <w:pPr>
+        <w:jc w:val="center"/>
         <w:rPr>
           <w:rFonts w:ascii="Times New Roman" w:hAnsi="Times New Roman"/>
           <w:sz w:val="24"/>
@@ -3212,8 +3375,9 @@
         <w:ind w:left="720" w:hanging="720"/>
         <w:jc w:val="both"/>
         <w:rPr>
-          <w:rFonts w:ascii="Times New Roman" w:hAnsi="Times New Roman"/>
-          <w:sz w:val="24"/>
+          <w:rFonts w:hint="default" w:ascii="Times New Roman" w:hAnsi="Times New Roman"/>
+          <w:sz w:val="24"/>
+          <w:lang w:val="en-US"/>
         </w:rPr>
       </w:pPr>
       <w:r>
@@ -3237,6 +3401,14 @@
         </w:rPr>
         <w:t>Application not accompanied with all the required documents shall not be accepted.</w:t>
       </w:r>
+      <w:r>
+        <w:rPr>
+          <w:rFonts w:hint="default"/>
+          <w:sz w:val="24"/>
+          <w:lang w:val="en-US"/>
+        </w:rPr>
+        <w:t xml:space="preserve"> ${qrCode}</w:t>
+      </w:r>
     </w:p>
     <w:p>
       <w:pPr>
@@ -3250,41 +3422,337 @@
     </w:p>
     <w:p>
       <w:pPr>
-        <w:ind w:left="720" w:hanging="720"/>
-        <w:jc w:val="both"/>
-        <w:rPr>
-          <w:rFonts w:ascii="Times New Roman" w:hAnsi="Times New Roman"/>
-          <w:sz w:val="24"/>
-        </w:rPr>
-      </w:pPr>
-    </w:p>
-    <w:p>
-      <w:pPr>
-        <w:ind w:left="720" w:hanging="720"/>
-        <w:jc w:val="both"/>
-        <w:rPr>
-          <w:rFonts w:ascii="Times New Roman" w:hAnsi="Times New Roman"/>
-          <w:sz w:val="24"/>
-        </w:rPr>
-      </w:pPr>
-    </w:p>
-    <w:p>
-      <w:pPr>
-        <w:ind w:left="720" w:hanging="720"/>
-        <w:jc w:val="both"/>
-        <w:rPr>
-          <w:rFonts w:ascii="Times New Roman" w:hAnsi="Times New Roman"/>
-          <w:sz w:val="24"/>
-        </w:rPr>
-      </w:pPr>
-    </w:p>
-    <w:p>
-      <w:pPr>
-        <w:ind w:left="720" w:hanging="720"/>
-        <w:jc w:val="both"/>
-        <w:rPr>
-          <w:rFonts w:ascii="Times New Roman" w:hAnsi="Times New Roman"/>
-          <w:sz w:val="24"/>
+        <w:jc w:val="both"/>
+        <w:rPr>
+          <w:rFonts w:hint="default" w:ascii="Times New Roman" w:hAnsi="Times New Roman" w:eastAsia="Segoe UI" w:cs="Times New Roman"/>
+          <w:i w:val="0"/>
+          <w:iCs w:val="0"/>
+          <w:caps w:val="0"/>
+          <w:color w:val="CCCCCC"/>
+          <w:spacing w:val="0"/>
+          <w:sz w:val="24"/>
+          <w:szCs w:val="24"/>
+          <w:lang w:val="en-US"/>
+        </w:rPr>
+      </w:pPr>
+    </w:p>
+    <w:p>
+      <w:pPr>
+        <w:jc w:val="both"/>
+        <w:rPr>
+          <w:rFonts w:hint="default" w:ascii="Times New Roman" w:hAnsi="Times New Roman" w:eastAsia="Segoe UI" w:cs="Times New Roman"/>
+          <w:i w:val="0"/>
+          <w:iCs w:val="0"/>
+          <w:caps w:val="0"/>
+          <w:color w:val="CCCCCC"/>
+          <w:spacing w:val="0"/>
+          <w:sz w:val="24"/>
+          <w:szCs w:val="24"/>
+          <w:lang w:val="en-US"/>
+        </w:rPr>
+      </w:pPr>
+    </w:p>
+    <w:p>
+      <w:pPr>
+        <w:jc w:val="both"/>
+        <w:rPr>
+          <w:rFonts w:hint="default" w:ascii="Times New Roman" w:hAnsi="Times New Roman" w:eastAsia="Segoe UI" w:cs="Times New Roman"/>
+          <w:i w:val="0"/>
+          <w:iCs w:val="0"/>
+          <w:caps w:val="0"/>
+          <w:color w:val="CCCCCC"/>
+          <w:spacing w:val="0"/>
+          <w:sz w:val="24"/>
+          <w:szCs w:val="24"/>
+          <w:lang w:val="en-US"/>
+        </w:rPr>
+      </w:pPr>
+    </w:p>
+    <w:p>
+      <w:pPr>
+        <w:jc w:val="both"/>
+        <w:rPr>
+          <w:rFonts w:hint="default" w:ascii="Times New Roman" w:hAnsi="Times New Roman" w:eastAsia="Segoe UI" w:cs="Times New Roman"/>
+          <w:i w:val="0"/>
+          <w:iCs w:val="0"/>
+          <w:caps w:val="0"/>
+          <w:color w:val="CCCCCC"/>
+          <w:spacing w:val="0"/>
+          <w:sz w:val="24"/>
+          <w:szCs w:val="24"/>
+          <w:lang w:val="en-US"/>
+        </w:rPr>
+      </w:pPr>
+    </w:p>
+    <w:p>
+      <w:pPr>
+        <w:jc w:val="both"/>
+        <w:rPr>
+          <w:rFonts w:hint="default" w:ascii="Times New Roman" w:hAnsi="Times New Roman" w:eastAsia="Segoe UI" w:cs="Times New Roman"/>
+          <w:i w:val="0"/>
+          <w:iCs w:val="0"/>
+          <w:caps w:val="0"/>
+          <w:color w:val="CCCCCC"/>
+          <w:spacing w:val="0"/>
+          <w:sz w:val="24"/>
+          <w:szCs w:val="24"/>
+          <w:lang w:val="en-US"/>
+        </w:rPr>
+      </w:pPr>
+    </w:p>
+    <w:p>
+      <w:pPr>
+        <w:jc w:val="both"/>
+        <w:rPr>
+          <w:rFonts w:hint="default" w:ascii="Times New Roman" w:hAnsi="Times New Roman" w:eastAsia="Segoe UI" w:cs="Times New Roman"/>
+          <w:i w:val="0"/>
+          <w:iCs w:val="0"/>
+          <w:caps w:val="0"/>
+          <w:color w:val="CCCCCC"/>
+          <w:spacing w:val="0"/>
+          <w:sz w:val="24"/>
+          <w:szCs w:val="24"/>
+          <w:lang w:val="en-US"/>
+        </w:rPr>
+      </w:pPr>
+    </w:p>
+    <w:p>
+      <w:pPr>
+        <w:jc w:val="both"/>
+        <w:rPr>
+          <w:rFonts w:hint="default" w:ascii="Times New Roman" w:hAnsi="Times New Roman" w:eastAsia="Segoe UI" w:cs="Times New Roman"/>
+          <w:i w:val="0"/>
+          <w:iCs w:val="0"/>
+          <w:caps w:val="0"/>
+          <w:color w:val="CCCCCC"/>
+          <w:spacing w:val="0"/>
+          <w:sz w:val="24"/>
+          <w:szCs w:val="24"/>
+          <w:lang w:val="en-US"/>
+        </w:rPr>
+      </w:pPr>
+    </w:p>
+    <w:p>
+      <w:pPr>
+        <w:jc w:val="both"/>
+        <w:rPr>
+          <w:rFonts w:hint="default" w:ascii="Times New Roman" w:hAnsi="Times New Roman" w:eastAsia="Segoe UI" w:cs="Times New Roman"/>
+          <w:i w:val="0"/>
+          <w:iCs w:val="0"/>
+          <w:caps w:val="0"/>
+          <w:color w:val="CCCCCC"/>
+          <w:spacing w:val="0"/>
+          <w:sz w:val="24"/>
+          <w:szCs w:val="24"/>
+          <w:lang w:val="en-US"/>
+        </w:rPr>
+      </w:pPr>
+    </w:p>
+    <w:p>
+      <w:pPr>
+        <w:jc w:val="both"/>
+        <w:rPr>
+          <w:rFonts w:hint="default" w:ascii="Times New Roman" w:hAnsi="Times New Roman" w:eastAsia="Segoe UI" w:cs="Times New Roman"/>
+          <w:i w:val="0"/>
+          <w:iCs w:val="0"/>
+          <w:caps w:val="0"/>
+          <w:color w:val="CCCCCC"/>
+          <w:spacing w:val="0"/>
+          <w:sz w:val="24"/>
+          <w:szCs w:val="24"/>
+          <w:lang w:val="en-US"/>
+        </w:rPr>
+      </w:pPr>
+    </w:p>
+    <w:p>
+      <w:pPr>
+        <w:jc w:val="both"/>
+        <w:rPr>
+          <w:rFonts w:hint="default" w:ascii="Times New Roman" w:hAnsi="Times New Roman" w:eastAsia="Segoe UI" w:cs="Times New Roman"/>
+          <w:i w:val="0"/>
+          <w:iCs w:val="0"/>
+          <w:caps w:val="0"/>
+          <w:color w:val="CCCCCC"/>
+          <w:spacing w:val="0"/>
+          <w:sz w:val="24"/>
+          <w:szCs w:val="24"/>
+          <w:lang w:val="en-US"/>
+        </w:rPr>
+      </w:pPr>
+    </w:p>
+    <w:p>
+      <w:pPr>
+        <w:jc w:val="both"/>
+        <w:rPr>
+          <w:rFonts w:hint="default" w:ascii="Times New Roman" w:hAnsi="Times New Roman" w:eastAsia="Segoe UI" w:cs="Times New Roman"/>
+          <w:i w:val="0"/>
+          <w:iCs w:val="0"/>
+          <w:caps w:val="0"/>
+          <w:color w:val="CCCCCC"/>
+          <w:spacing w:val="0"/>
+          <w:sz w:val="24"/>
+          <w:szCs w:val="24"/>
+          <w:lang w:val="en-US"/>
+        </w:rPr>
+      </w:pPr>
+    </w:p>
+    <w:p>
+      <w:pPr>
+        <w:jc w:val="both"/>
+        <w:rPr>
+          <w:rFonts w:hint="default" w:ascii="Times New Roman" w:hAnsi="Times New Roman" w:eastAsia="Segoe UI" w:cs="Times New Roman"/>
+          <w:i w:val="0"/>
+          <w:iCs w:val="0"/>
+          <w:caps w:val="0"/>
+          <w:color w:val="CCCCCC"/>
+          <w:spacing w:val="0"/>
+          <w:sz w:val="24"/>
+          <w:szCs w:val="24"/>
+          <w:lang w:val="en-US"/>
+        </w:rPr>
+      </w:pPr>
+    </w:p>
+    <w:p>
+      <w:pPr>
+        <w:jc w:val="both"/>
+        <w:rPr>
+          <w:rFonts w:hint="default" w:ascii="Times New Roman" w:hAnsi="Times New Roman" w:eastAsia="Segoe UI" w:cs="Times New Roman"/>
+          <w:i w:val="0"/>
+          <w:iCs w:val="0"/>
+          <w:caps w:val="0"/>
+          <w:color w:val="CCCCCC"/>
+          <w:spacing w:val="0"/>
+          <w:sz w:val="24"/>
+          <w:szCs w:val="24"/>
+          <w:lang w:val="en-US"/>
+        </w:rPr>
+      </w:pPr>
+    </w:p>
+    <w:p>
+      <w:pPr>
+        <w:jc w:val="both"/>
+        <w:rPr>
+          <w:rFonts w:hint="default" w:ascii="Times New Roman" w:hAnsi="Times New Roman" w:eastAsia="Segoe UI" w:cs="Times New Roman"/>
+          <w:i w:val="0"/>
+          <w:iCs w:val="0"/>
+          <w:caps w:val="0"/>
+          <w:color w:val="CCCCCC"/>
+          <w:spacing w:val="0"/>
+          <w:sz w:val="24"/>
+          <w:szCs w:val="24"/>
+          <w:lang w:val="en-US"/>
+        </w:rPr>
+      </w:pPr>
+    </w:p>
+    <w:p>
+      <w:pPr>
+        <w:jc w:val="both"/>
+        <w:rPr>
+          <w:rFonts w:hint="default" w:ascii="Times New Roman" w:hAnsi="Times New Roman" w:eastAsia="Segoe UI" w:cs="Times New Roman"/>
+          <w:i w:val="0"/>
+          <w:iCs w:val="0"/>
+          <w:caps w:val="0"/>
+          <w:color w:val="CCCCCC"/>
+          <w:spacing w:val="0"/>
+          <w:sz w:val="24"/>
+          <w:szCs w:val="24"/>
+          <w:lang w:val="en-US"/>
+        </w:rPr>
+      </w:pPr>
+    </w:p>
+    <w:p>
+      <w:pPr>
+        <w:jc w:val="both"/>
+        <w:rPr>
+          <w:rFonts w:hint="default" w:ascii="Times New Roman" w:hAnsi="Times New Roman" w:eastAsia="Segoe UI" w:cs="Times New Roman"/>
+          <w:i w:val="0"/>
+          <w:iCs w:val="0"/>
+          <w:caps w:val="0"/>
+          <w:color w:val="CCCCCC"/>
+          <w:spacing w:val="0"/>
+          <w:sz w:val="24"/>
+          <w:szCs w:val="24"/>
+          <w:lang w:val="en-US"/>
+        </w:rPr>
+      </w:pPr>
+    </w:p>
+    <w:p>
+      <w:pPr>
+        <w:jc w:val="both"/>
+        <w:rPr>
+          <w:rFonts w:hint="default" w:ascii="Times New Roman" w:hAnsi="Times New Roman" w:eastAsia="Segoe UI" w:cs="Times New Roman"/>
+          <w:i w:val="0"/>
+          <w:iCs w:val="0"/>
+          <w:caps w:val="0"/>
+          <w:color w:val="CCCCCC"/>
+          <w:spacing w:val="0"/>
+          <w:sz w:val="24"/>
+          <w:szCs w:val="24"/>
+          <w:lang w:val="en-US"/>
+        </w:rPr>
+      </w:pPr>
+    </w:p>
+    <w:p>
+      <w:pPr>
+        <w:jc w:val="both"/>
+        <w:rPr>
+          <w:rFonts w:hint="default" w:ascii="Times New Roman" w:hAnsi="Times New Roman" w:eastAsia="Segoe UI" w:cs="Times New Roman"/>
+          <w:i w:val="0"/>
+          <w:iCs w:val="0"/>
+          <w:caps w:val="0"/>
+          <w:color w:val="CCCCCC"/>
+          <w:spacing w:val="0"/>
+          <w:sz w:val="24"/>
+          <w:szCs w:val="24"/>
+          <w:lang w:val="en-US"/>
+        </w:rPr>
+      </w:pPr>
+    </w:p>
+    <w:p>
+      <w:pPr>
+        <w:jc w:val="both"/>
+        <w:rPr>
+          <w:rFonts w:hint="default" w:ascii="Times New Roman" w:hAnsi="Times New Roman" w:eastAsia="Segoe UI" w:cs="Times New Roman"/>
+          <w:i w:val="0"/>
+          <w:iCs w:val="0"/>
+          <w:caps w:val="0"/>
+          <w:color w:val="CCCCCC"/>
+          <w:spacing w:val="0"/>
+          <w:sz w:val="24"/>
+          <w:szCs w:val="24"/>
+          <w:lang w:val="en-US"/>
+        </w:rPr>
+      </w:pPr>
+    </w:p>
+    <w:p>
+      <w:pPr>
+        <w:jc w:val="both"/>
+        <w:rPr>
+          <w:rFonts w:hint="default" w:ascii="Times New Roman" w:hAnsi="Times New Roman" w:eastAsia="Segoe UI" w:cs="Times New Roman"/>
+          <w:i w:val="0"/>
+          <w:iCs w:val="0"/>
+          <w:caps w:val="0"/>
+          <w:color w:val="CCCCCC"/>
+          <w:spacing w:val="0"/>
+          <w:sz w:val="24"/>
+          <w:szCs w:val="24"/>
+          <w:lang w:val="en-US"/>
+        </w:rPr>
+      </w:pPr>
+    </w:p>
+    <w:p>
+      <w:pPr>
+        <w:jc w:val="both"/>
+        <w:rPr>
+          <w:rFonts w:hint="default" w:ascii="Times New Roman" w:hAnsi="Times New Roman" w:eastAsia="Segoe UI" w:cs="Times New Roman"/>
+          <w:i w:val="0"/>
+          <w:iCs w:val="0"/>
+          <w:caps w:val="0"/>
+          <w:color w:val="CCCCCC"/>
+          <w:spacing w:val="0"/>
+          <w:sz w:val="24"/>
+          <w:szCs w:val="24"/>
+          <w:lang w:val="en-US"/>
         </w:rPr>
       </w:pPr>
     </w:p>
@@ -3416,8 +3884,8 @@
     <w:lsdException w:uiPriority="99" w:name="Normal Indent"/>
     <w:lsdException w:uiPriority="99" w:name="footnote text"/>
     <w:lsdException w:uiPriority="99" w:name="annotation text"/>
-    <w:lsdException w:unhideWhenUsed="0" w:uiPriority="0" w:name="header"/>
-    <w:lsdException w:unhideWhenUsed="0" w:uiPriority="0" w:name="footer"/>
+    <w:lsdException w:qFormat="1" w:unhideWhenUsed="0" w:uiPriority="0" w:name="header"/>
+    <w:lsdException w:qFormat="1" w:unhideWhenUsed="0" w:uiPriority="0" w:name="footer"/>
     <w:lsdException w:uiPriority="99" w:name="index heading"/>
     <w:lsdException w:qFormat="1" w:uiPriority="35" w:name="caption"/>
     <w:lsdException w:uiPriority="99" w:name="table of figures"/>
@@ -3426,9 +3894,9 @@
     <w:lsdException w:uiPriority="99" w:name="footnote reference"/>
     <w:lsdException w:uiPriority="99" w:name="annotation reference"/>
     <w:lsdException w:uiPriority="99" w:name="line number"/>
-    <w:lsdException w:unhideWhenUsed="0" w:uiPriority="0" w:name="page number"/>
+    <w:lsdException w:qFormat="1" w:unhideWhenUsed="0" w:uiPriority="0" w:name="page number"/>
     <w:lsdException w:uiPriority="99" w:name="endnote reference"/>
-    <w:lsdException w:unhideWhenUsed="0" w:uiPriority="0" w:name="endnote text"/>
+    <w:lsdException w:qFormat="1" w:unhideWhenUsed="0" w:uiPriority="0" w:name="endnote text"/>
     <w:lsdException w:uiPriority="99" w:name="table of authorities"/>
     <w:lsdException w:uiPriority="99" w:name="macro"/>
     <w:lsdException w:uiPriority="99" w:name="toa heading"/>
@@ -3488,7 +3956,7 @@
     <w:lsdException w:uiPriority="99" w:name="HTML Sample"/>
     <w:lsdException w:uiPriority="99" w:name="HTML Typewriter"/>
     <w:lsdException w:uiPriority="99" w:name="HTML Variable"/>
-    <w:lsdException w:uiPriority="99" w:semiHidden="0" w:name="Normal Table"/>
+    <w:lsdException w:qFormat="1" w:uiPriority="99" w:semiHidden="0" w:name="Normal Table"/>
     <w:lsdException w:uiPriority="99" w:name="annotation subject"/>
     <w:lsdException w:uiPriority="99" w:name="Table Simple 1"/>
     <w:lsdException w:uiPriority="99" w:name="Table Simple 2"/>
@@ -3652,6 +4120,7 @@
   <w:style w:type="table" w:default="1" w:styleId="3">
     <w:name w:val="Normal Table"/>
     <w:unhideWhenUsed/>
+    <w:qFormat/>
     <w:uiPriority w:val="99"/>
     <w:tblPr>
       <w:tblCellMar>
@@ -3666,12 +4135,14 @@
     <w:name w:val="endnote text"/>
     <w:basedOn w:val="1"/>
     <w:semiHidden/>
+    <w:qFormat/>
     <w:uiPriority w:val="0"/>
   </w:style>
   <w:style w:type="paragraph" w:styleId="5">
     <w:name w:val="footer"/>
     <w:basedOn w:val="1"/>
     <w:semiHidden/>
+    <w:qFormat/>
     <w:uiPriority w:val="0"/>
     <w:pPr>
       <w:tabs>
@@ -3684,6 +4155,7 @@
     <w:name w:val="header"/>
     <w:basedOn w:val="1"/>
     <w:semiHidden/>
+    <w:qFormat/>
     <w:uiPriority w:val="0"/>
     <w:pPr>
       <w:tabs>
@@ -3696,7 +4168,27 @@
     <w:name w:val="page number"/>
     <w:basedOn w:val="2"/>
     <w:semiHidden/>
+    <w:qFormat/>
     <w:uiPriority w:val="0"/>
+  </w:style>
+  <w:style w:type="table" w:styleId="8">
+    <w:name w:val="Table Grid"/>
+    <w:basedOn w:val="3"/>
+    <w:uiPriority w:val="39"/>
+    <w:pPr>
+      <w:widowControl w:val="0"/>
+      <w:jc w:val="both"/>
+    </w:pPr>
+    <w:tblPr>
+      <w:tblBorders>
+        <w:top w:val="single" w:color="auto" w:sz="4" w:space="0"/>
+        <w:left w:val="single" w:color="auto" w:sz="4" w:space="0"/>
+        <w:bottom w:val="single" w:color="auto" w:sz="4" w:space="0"/>
+        <w:right w:val="single" w:color="auto" w:sz="4" w:space="0"/>
+        <w:insideH w:val="single" w:color="auto" w:sz="4" w:space="0"/>
+        <w:insideV w:val="single" w:color="auto" w:sz="4" w:space="0"/>
+      </w:tblBorders>
+    </w:tblPr>
   </w:style>
 </w:styles>
 </file>

</xml_diff>